<commit_message>
Pasang tanda tangan Bu Nina di formulir permohonan TTH
Co-Authored-By: Claude Opus 5.5 <noreply@anthropic.com>
Claude-Session: https://claude.ai/code/session_01C7NGhdgEYTnPnqTzQgCAkB
</commit_message>
<xml_diff>
--- a/Deliverables/Permohonan_Uji_CT_TTH_EMC_GLD_LGU.docx
+++ b/Deliverables/Permohonan_Uji_CT_TTH_EMC_GLD_LGU.docx
@@ -1109,16 +1109,38 @@
               <w:jc w:val="center"/>
             </w:pPr>
             <w:r>
-              <w:rPr>
-                <w:b w:val="0"/>
-                <w:i w:val="0"/>
-                <w:sz w:val="19"/>
-              </w:rPr>
-              <w:br/>
-              <w:br/>
-              <w:br/>
-              <w:t>Tanda tangan</w:t>
-              <w:br/>
+              <w:drawing>
+                <wp:inline xmlns:a="http://schemas.openxmlformats.org/drawingml/2006/main" xmlns:pic="http://schemas.openxmlformats.org/drawingml/2006/picture">
+                  <wp:extent cx="883961" cy="720000"/>
+                  <wp:docPr id="1" name="Picture 1"/>
+                  <wp:cNvGraphicFramePr>
+                    <a:graphicFrameLocks noChangeAspect="1"/>
+                  </wp:cNvGraphicFramePr>
+                  <a:graphic>
+                    <a:graphicData uri="http://schemas.openxmlformats.org/drawingml/2006/picture">
+                      <pic:pic>
+                        <pic:nvPicPr>
+                          <pic:cNvPr id="0" name="ttd_nina_siti_aminah.png"/>
+                          <pic:cNvPicPr/>
+                        </pic:nvPicPr>
+                        <pic:blipFill>
+                          <a:blip r:embed="rId10"/>
+                          <a:stretch>
+                            <a:fillRect/>
+                          </a:stretch>
+                        </pic:blipFill>
+                        <pic:spPr>
+                          <a:xfrm>
+                            <a:off x="0" y="0"/>
+                            <a:ext cx="883961" cy="720000"/>
+                          </a:xfrm>
+                          <a:prstGeom prst="rect"/>
+                        </pic:spPr>
+                      </pic:pic>
+                    </a:graphicData>
+                  </a:graphic>
+                </wp:inline>
+              </w:drawing>
             </w:r>
           </w:p>
         </w:tc>

</xml_diff>